<commit_message>
fix: Laboratory 3 OS
</commit_message>
<xml_diff>
--- a/OS/Laboratory_03/ОС ЛР3.docx
+++ b/OS/Laboratory_03/ОС ЛР3.docx
@@ -1,6 +1,6 @@
 
 <file path=word/document.xml><?xml version="1.0" encoding="utf-8"?>
-<w:document xmlns:wpc="http://schemas.microsoft.com/office/word/2010/wordprocessingCanvas" xmlns:cx="http://schemas.microsoft.com/office/drawing/2014/chartex" xmlns:cx1="http://schemas.microsoft.com/office/drawing/2015/9/8/chartex" xmlns:cx2="http://schemas.microsoft.com/office/drawing/2015/10/21/chartex" xmlns:cx3="http://schemas.microsoft.com/office/drawing/2016/5/9/chartex" xmlns:cx4="http://schemas.microsoft.com/office/drawing/2016/5/10/chartex" xmlns:cx5="http://schemas.microsoft.com/office/drawing/2016/5/11/chartex" xmlns:cx6="http://schemas.microsoft.com/office/drawing/2016/5/12/chartex" xmlns:cx7="http://schemas.microsoft.com/office/drawing/2016/5/13/chartex" xmlns:cx8="http://schemas.microsoft.com/office/drawing/2016/5/14/chartex" xmlns:mc="http://schemas.openxmlformats.org/markup-compatibility/2006" xmlns:aink="http://schemas.microsoft.com/office/drawing/2016/ink" xmlns:am3d="http://schemas.microsoft.com/office/drawing/2017/model3d" xmlns:o="urn:schemas-microsoft-com:office:office" xmlns:oel="http://schemas.microsoft.com/office/2019/extlst" xmlns:r="http://schemas.openxmlformats.org/officeDocument/2006/relationships" xmlns:m="http://schemas.openxmlformats.org/officeDocument/2006/math" xmlns:v="urn:schemas-microsoft-com:vml" xmlns:wp14="http://schemas.microsoft.com/office/word/2010/wordprocessingDrawing" xmlns:wp="http://schemas.openxmlformats.org/drawingml/2006/wordprocessingDrawing" xmlns:w10="urn:schemas-microsoft-com:office:word" xmlns:w="http://schemas.openxmlformats.org/wordprocessingml/2006/main" xmlns:w14="http://schemas.microsoft.com/office/word/2010/wordml" xmlns:w15="http://schemas.microsoft.com/office/word/2012/wordml" xmlns:w16cex="http://schemas.microsoft.com/office/word/2018/wordml/cex" xmlns:w16cid="http://schemas.microsoft.com/office/word/2016/wordml/cid" xmlns:w16="http://schemas.microsoft.com/office/word/2018/wordml" xmlns:w16sdtdh="http://schemas.microsoft.com/office/word/2020/wordml/sdtdatahash" xmlns:w16se="http://schemas.microsoft.com/office/word/2015/wordml/symex" xmlns:wpg="http://schemas.microsoft.com/office/word/2010/wordprocessingGroup" xmlns:wpi="http://schemas.microsoft.com/office/word/2010/wordprocessingInk" xmlns:wne="http://schemas.microsoft.com/office/word/2006/wordml" xmlns:wps="http://schemas.microsoft.com/office/word/2010/wordprocessingShape" mc:Ignorable="w14 w15 w16se w16cid w16 w16cex w16sdtdh wp14">
+<w:document xmlns:wpc="http://schemas.microsoft.com/office/word/2010/wordprocessingCanvas" xmlns:cx="http://schemas.microsoft.com/office/drawing/2014/chartex" xmlns:cx1="http://schemas.microsoft.com/office/drawing/2015/9/8/chartex" xmlns:cx2="http://schemas.microsoft.com/office/drawing/2015/10/21/chartex" xmlns:cx3="http://schemas.microsoft.com/office/drawing/2016/5/9/chartex" xmlns:cx4="http://schemas.microsoft.com/office/drawing/2016/5/10/chartex" xmlns:cx5="http://schemas.microsoft.com/office/drawing/2016/5/11/chartex" xmlns:cx6="http://schemas.microsoft.com/office/drawing/2016/5/12/chartex" xmlns:cx7="http://schemas.microsoft.com/office/drawing/2016/5/13/chartex" xmlns:cx8="http://schemas.microsoft.com/office/drawing/2016/5/14/chartex" xmlns:mc="http://schemas.openxmlformats.org/markup-compatibility/2006" xmlns:aink="http://schemas.microsoft.com/office/drawing/2016/ink" xmlns:am3d="http://schemas.microsoft.com/office/drawing/2017/model3d" xmlns:o="urn:schemas-microsoft-com:office:office" xmlns:r="http://schemas.openxmlformats.org/officeDocument/2006/relationships" xmlns:m="http://schemas.openxmlformats.org/officeDocument/2006/math" xmlns:v="urn:schemas-microsoft-com:vml" xmlns:wp14="http://schemas.microsoft.com/office/word/2010/wordprocessingDrawing" xmlns:wp="http://schemas.openxmlformats.org/drawingml/2006/wordprocessingDrawing" xmlns:w10="urn:schemas-microsoft-com:office:word" xmlns:w="http://schemas.openxmlformats.org/wordprocessingml/2006/main" xmlns:w14="http://schemas.microsoft.com/office/word/2010/wordml" xmlns:w15="http://schemas.microsoft.com/office/word/2012/wordml" xmlns:w16cex="http://schemas.microsoft.com/office/word/2018/wordml/cex" xmlns:w16cid="http://schemas.microsoft.com/office/word/2016/wordml/cid" xmlns:w16="http://schemas.microsoft.com/office/word/2018/wordml" xmlns:w16sdtdh="http://schemas.microsoft.com/office/word/2020/wordml/sdtdatahash" xmlns:w16se="http://schemas.microsoft.com/office/word/2015/wordml/symex" xmlns:wpg="http://schemas.microsoft.com/office/word/2010/wordprocessingGroup" xmlns:wpi="http://schemas.microsoft.com/office/word/2010/wordprocessingInk" xmlns:wne="http://schemas.microsoft.com/office/word/2006/wordml" xmlns:wps="http://schemas.microsoft.com/office/word/2010/wordprocessingShape" mc:Ignorable="w14 w15 w16se w16cid w16 w16cex w16sdtdh wp14">
   <w:body>
     <w:p>
       <w:pPr>
@@ -94,25 +94,7 @@
             <w:sz w:val="28"/>
             <w:szCs w:val="28"/>
           </w:rPr>
-          <w:t>gm</w:t>
-        </w:r>
-        <w:r>
-          <w:rPr>
-            <w:rStyle w:val="a4"/>
-            <w:rFonts w:ascii="Times New Roman" w:hAnsi="Times New Roman" w:cs="Times New Roman"/>
-            <w:sz w:val="28"/>
-            <w:szCs w:val="28"/>
-          </w:rPr>
-          <w:t>a</w:t>
-        </w:r>
-        <w:r>
-          <w:rPr>
-            <w:rStyle w:val="a4"/>
-            <w:rFonts w:ascii="Times New Roman" w:hAnsi="Times New Roman" w:cs="Times New Roman"/>
-            <w:sz w:val="28"/>
-            <w:szCs w:val="28"/>
-          </w:rPr>
-          <w:t>il</w:t>
+          <w:t>gmail</w:t>
         </w:r>
         <w:r>
           <w:rPr>
@@ -172,16 +154,7 @@
           <w:szCs w:val="28"/>
           <w:lang w:val="ru-RU"/>
         </w:rPr>
-        <w:t>письма</w:t>
-      </w:r>
-      <w:r>
-        <w:rPr>
-          <w:rFonts w:ascii="Times New Roman" w:hAnsi="Times New Roman" w:cs="Times New Roman"/>
-          <w:sz w:val="28"/>
-          <w:szCs w:val="28"/>
-          <w:lang w:val="ru-RU"/>
-        </w:rPr>
-        <w:t xml:space="preserve"> </w:t>
+        <w:t xml:space="preserve">письма </w:t>
       </w:r>
       <w:r>
         <w:rPr>
@@ -301,16 +274,7 @@
           <w:szCs w:val="28"/>
           <w:lang w:val="ru-RU"/>
         </w:rPr>
-        <w:t xml:space="preserve"> или </w:t>
-      </w:r>
-      <w:r>
-        <w:rPr>
-          <w:rFonts w:ascii="Times New Roman" w:hAnsi="Times New Roman" w:cs="Times New Roman"/>
-          <w:sz w:val="28"/>
-          <w:szCs w:val="28"/>
-          <w:lang w:val="ru-RU"/>
-        </w:rPr>
-        <w:t>«ОС 3/1 Уласевич Н. И. №1</w:t>
+        <w:t xml:space="preserve"> или «ОС 3/1 Уласевич Н. И. №1</w:t>
       </w:r>
       <w:r>
         <w:rPr>
@@ -481,25 +445,7 @@
           <w:szCs w:val="28"/>
           <w:lang w:val="ru-RU"/>
         </w:rPr>
-        <w:t>Максимально допустимая задержка — одна работа: отчёт по предыдущей лабораторной должен быть отправлен не позднее дня сдачи следующей.</w:t>
-      </w:r>
-      <w:r>
-        <w:rPr>
-          <w:rFonts w:ascii="Times New Roman" w:hAnsi="Times New Roman" w:cs="Times New Roman"/>
-          <w:sz w:val="28"/>
-          <w:szCs w:val="28"/>
-          <w:lang w:val="ru-RU"/>
-        </w:rPr>
-        <w:t xml:space="preserve"> </w:t>
-      </w:r>
-      <w:r>
-        <w:rPr>
-          <w:rFonts w:ascii="Times New Roman" w:hAnsi="Times New Roman" w:cs="Times New Roman"/>
-          <w:sz w:val="28"/>
-          <w:szCs w:val="28"/>
-          <w:lang w:val="ru-RU"/>
-        </w:rPr>
-        <w:t>Например, если 4-я работа сдана 26.09.2026, то отчёт по 3-й должен быть отправлен в этот же день.</w:t>
+        <w:t>Максимально допустимая задержка — одна работа: отчёт по предыдущей лабораторной должен быть отправлен не позднее дня сдачи следующей. Например, если 4-я работа сдана 26.09.2026, то отчёт по 3-й должен быть отправлен в этот же день.</w:t>
       </w:r>
       <w:r>
         <w:rPr>
@@ -1475,69 +1421,6 @@
         </w:rPr>
         <w:t xml:space="preserve"> </w:t>
       </w:r>
-      <w:proofErr w:type="gramStart"/>
-      <w:r>
-        <w:rPr>
-          <w:rFonts w:ascii="Times New Roman" w:hAnsi="Times New Roman" w:cs="Times New Roman"/>
-          <w:color w:val="FFFFFF" w:themeColor="background1"/>
-          <w:sz w:val="28"/>
-          <w:szCs w:val="28"/>
-          <w:lang w:val="ru-RU"/>
-        </w:rPr>
-        <w:t>Использовать</w:t>
-      </w:r>
-      <w:proofErr w:type="gramEnd"/>
-      <w:r>
-        <w:rPr>
-          <w:rFonts w:ascii="Times New Roman" w:hAnsi="Times New Roman" w:cs="Times New Roman"/>
-          <w:color w:val="FFFFFF" w:themeColor="background1"/>
-          <w:sz w:val="28"/>
-          <w:szCs w:val="28"/>
-          <w:lang w:val="ru-RU"/>
-        </w:rPr>
-        <w:t xml:space="preserve"> для выхода только</w:t>
-      </w:r>
-      <w:r>
-        <w:rPr>
-          <w:rFonts w:ascii="Times New Roman" w:hAnsi="Times New Roman" w:cs="Times New Roman"/>
-          <w:color w:val="FFFFFF" w:themeColor="background1"/>
-          <w:sz w:val="28"/>
-          <w:szCs w:val="28"/>
-          <w:lang w:val="ru-RU"/>
-        </w:rPr>
-        <w:t xml:space="preserve"> ошибку </w:t>
-      </w:r>
-      <w:r>
-        <w:rPr>
-          <w:rFonts w:ascii="Times New Roman" w:hAnsi="Times New Roman" w:cs="Times New Roman"/>
-          <w:color w:val="FFFFFF" w:themeColor="background1"/>
-          <w:sz w:val="28"/>
-          <w:szCs w:val="28"/>
-          <w:lang w:val="ru-RU"/>
-        </w:rPr>
-        <w:t>0</w:t>
-      </w:r>
-      <w:proofErr w:type="spellStart"/>
-      <w:r>
-        <w:rPr>
-          <w:rFonts w:ascii="Times New Roman" w:hAnsi="Times New Roman" w:cs="Times New Roman"/>
-          <w:color w:val="FFFFFF" w:themeColor="background1"/>
-          <w:sz w:val="28"/>
-          <w:szCs w:val="28"/>
-        </w:rPr>
-        <w:t>xC</w:t>
-      </w:r>
-      <w:proofErr w:type="spellEnd"/>
-      <w:r>
-        <w:rPr>
-          <w:rFonts w:ascii="Times New Roman" w:hAnsi="Times New Roman" w:cs="Times New Roman"/>
-          <w:color w:val="FFFFFF" w:themeColor="background1"/>
-          <w:sz w:val="28"/>
-          <w:szCs w:val="28"/>
-          <w:lang w:val="ru-RU"/>
-        </w:rPr>
-        <w:t>0000005</w:t>
-      </w:r>
     </w:p>
     <w:p>
       <w:pPr>
@@ -1978,25 +1861,14 @@
         </w:rPr>
         <w:t xml:space="preserve"> </w:t>
       </w:r>
-      <w:proofErr w:type="gramStart"/>
-      <w:r>
-        <w:rPr>
-          <w:rFonts w:ascii="Times New Roman" w:hAnsi="Times New Roman" w:cs="Times New Roman"/>
-          <w:sz w:val="28"/>
-          <w:szCs w:val="28"/>
-          <w:lang w:val="ru-RU"/>
-        </w:rPr>
-        <w:t>По сути</w:t>
-      </w:r>
-      <w:proofErr w:type="gramEnd"/>
-      <w:r>
-        <w:rPr>
-          <w:rFonts w:ascii="Times New Roman" w:hAnsi="Times New Roman" w:cs="Times New Roman"/>
-          <w:sz w:val="28"/>
-          <w:szCs w:val="28"/>
-          <w:lang w:val="ru-RU"/>
-        </w:rPr>
-        <w:t xml:space="preserve"> взять строку из предыдущего пункта и передать во второй параметр.</w:t>
+      <w:r>
+        <w:rPr>
+          <w:rFonts w:ascii="Times New Roman" w:hAnsi="Times New Roman" w:cs="Times New Roman"/>
+          <w:sz w:val="28"/>
+          <w:szCs w:val="28"/>
+          <w:lang w:val="ru-RU"/>
+        </w:rPr>
+        <w:t>По сути взять строку из предыдущего пункта и передать во второй параметр.</w:t>
       </w:r>
     </w:p>
     <w:p>
@@ -2110,7 +1982,6 @@
         </w:rPr>
         <w:t>Вопрос</w:t>
       </w:r>
-      <w:proofErr w:type="gramStart"/>
       <w:r>
         <w:rPr>
           <w:rFonts w:ascii="Times New Roman" w:hAnsi="Times New Roman" w:cs="Times New Roman"/>
@@ -2120,19 +1991,7 @@
           <w:szCs w:val="28"/>
           <w:lang w:val="ru-RU"/>
         </w:rPr>
-        <w:t>: Все</w:t>
-      </w:r>
-      <w:proofErr w:type="gramEnd"/>
-      <w:r>
-        <w:rPr>
-          <w:rFonts w:ascii="Times New Roman" w:hAnsi="Times New Roman" w:cs="Times New Roman"/>
-          <w:bCs/>
-          <w:i/>
-          <w:sz w:val="28"/>
-          <w:szCs w:val="28"/>
-          <w:lang w:val="ru-RU"/>
-        </w:rPr>
-        <w:t xml:space="preserve"> ли процессы созданы успешно? Если нет, почему?</w:t>
+        <w:t>: Все ли процессы созданы успешно? Если нет, почему?</w:t>
       </w:r>
     </w:p>
     <w:p>
@@ -2686,43 +2545,18 @@
           <w:szCs w:val="28"/>
           <w:lang w:val="ru-RU"/>
         </w:rPr>
-        <w:t>Вопрос</w:t>
-      </w:r>
-      <w:proofErr w:type="gramStart"/>
-      <w:r>
-        <w:rPr>
-          <w:rFonts w:ascii="Times New Roman" w:hAnsi="Times New Roman" w:cs="Times New Roman"/>
-          <w:b/>
+        <w:t xml:space="preserve">Вопрос: </w:t>
+      </w:r>
+      <w:r>
+        <w:rPr>
+          <w:rFonts w:ascii="Times New Roman" w:hAnsi="Times New Roman" w:cs="Times New Roman"/>
           <w:bCs/>
           <w:i/>
           <w:sz w:val="28"/>
           <w:szCs w:val="28"/>
           <w:lang w:val="ru-RU"/>
         </w:rPr>
-        <w:t xml:space="preserve">: </w:t>
-      </w:r>
-      <w:r>
-        <w:rPr>
-          <w:rFonts w:ascii="Times New Roman" w:hAnsi="Times New Roman" w:cs="Times New Roman"/>
-          <w:bCs/>
-          <w:i/>
-          <w:sz w:val="28"/>
-          <w:szCs w:val="28"/>
-          <w:lang w:val="ru-RU"/>
-        </w:rPr>
-        <w:t>Все</w:t>
-      </w:r>
-      <w:proofErr w:type="gramEnd"/>
-      <w:r>
-        <w:rPr>
-          <w:rFonts w:ascii="Times New Roman" w:hAnsi="Times New Roman" w:cs="Times New Roman"/>
-          <w:bCs/>
-          <w:i/>
-          <w:sz w:val="28"/>
-          <w:szCs w:val="28"/>
-          <w:lang w:val="ru-RU"/>
-        </w:rPr>
-        <w:t xml:space="preserve"> ли процессы созданы успешно? Сколько итераций выполнил каждый процесс и почему?</w:t>
+        <w:t>Все ли процессы созданы успешно? Сколько итераций выполнил каждый процесс и почему?</w:t>
       </w:r>
     </w:p>
     <w:p>
@@ -3177,27 +3011,7 @@
           <w:szCs w:val="28"/>
           <w:lang w:val="ru-RU"/>
         </w:rPr>
-        <w:t xml:space="preserve">Считать, что </w:t>
-      </w:r>
-      <w:proofErr w:type="gramStart"/>
-      <w:r>
-        <w:rPr>
-          <w:rFonts w:ascii="Times New Roman" w:hAnsi="Times New Roman" w:cs="Times New Roman"/>
-          <w:sz w:val="28"/>
-          <w:szCs w:val="28"/>
-          <w:lang w:val="ru-RU"/>
-        </w:rPr>
-        <w:t>M &gt;</w:t>
-      </w:r>
-      <w:proofErr w:type="gramEnd"/>
-      <w:r>
-        <w:rPr>
-          <w:rFonts w:ascii="Times New Roman" w:hAnsi="Times New Roman" w:cs="Times New Roman"/>
-          <w:sz w:val="28"/>
-          <w:szCs w:val="28"/>
-          <w:lang w:val="ru-RU"/>
-        </w:rPr>
-        <w:t xml:space="preserve"> 0 и L ≥ 1.</w:t>
+        <w:t>Считать, что M &gt; 0 и L ≥ 1.</w:t>
       </w:r>
     </w:p>
     <w:p>
@@ -3640,16 +3454,7 @@
           <w:szCs w:val="28"/>
           <w:lang w:val="ru-RU"/>
         </w:rPr>
-        <w:t>&lt;</w:t>
-      </w:r>
-      <w:r>
-        <w:rPr>
-          <w:rFonts w:ascii="Times New Roman" w:hAnsi="Times New Roman" w:cs="Times New Roman"/>
-          <w:sz w:val="28"/>
-          <w:szCs w:val="28"/>
-          <w:lang w:val="ru-RU"/>
-        </w:rPr>
-        <w:t>Количество создаваемых процессов&gt; &lt;Число M&gt; &lt;Нижний порог диапазона&gt; &lt;Верхний порог диапазона&gt;</w:t>
+        <w:t>&lt;Количество создаваемых процессов&gt; &lt;Число M&gt; &lt;Нижний порог диапазона&gt; &lt;Верхний порог диапазона&gt;</w:t>
       </w:r>
     </w:p>
     <w:p>
@@ -3861,41 +3666,12 @@
       <w:r>
         <w:rPr>
           <w:rFonts w:ascii="Times New Roman" w:hAnsi="Times New Roman" w:cs="Times New Roman"/>
+          <w:color w:val="FF0000"/>
           <w:sz w:val="28"/>
           <w:szCs w:val="28"/>
           <w:lang w:val="ru-RU"/>
         </w:rPr>
         <w:t xml:space="preserve"> </w:t>
-      </w:r>
-      <w:r>
-        <w:rPr>
-          <w:rFonts w:ascii="Times New Roman" w:hAnsi="Times New Roman" w:cs="Times New Roman"/>
-          <w:color w:val="FFFFFF" w:themeColor="background1"/>
-          <w:sz w:val="18"/>
-          <w:szCs w:val="18"/>
-          <w:lang w:val="ru-RU"/>
-        </w:rPr>
-        <w:t>Если диапазон не делится нацело,</w:t>
-      </w:r>
-      <w:r>
-        <w:rPr>
-          <w:rFonts w:ascii="Times New Roman" w:hAnsi="Times New Roman" w:cs="Times New Roman"/>
-          <w:color w:val="FFFFFF" w:themeColor="background1"/>
-          <w:sz w:val="18"/>
-          <w:szCs w:val="18"/>
-          <w:lang w:val="ru-RU"/>
-        </w:rPr>
-        <w:t xml:space="preserve"> </w:t>
-      </w:r>
-      <w:r>
-        <w:rPr>
-          <w:rFonts w:ascii="Times New Roman" w:hAnsi="Times New Roman" w:cs="Times New Roman"/>
-          <w:color w:val="FFFFFF" w:themeColor="background1"/>
-          <w:sz w:val="18"/>
-          <w:szCs w:val="18"/>
-          <w:lang w:val="ru-RU"/>
-        </w:rPr>
-        <w:t>второй поддиапазон расширяется на величину остатка</w:t>
       </w:r>
     </w:p>
     <w:p>
@@ -3948,7 +3724,7 @@
           <w:szCs w:val="28"/>
           <w:lang w:val="ru-RU"/>
         </w:rPr>
-        <w:t xml:space="preserve">редусмотреть обработку ошибок и очистку ресурсов. </w:t>
+        <w:t>редусмотреть обработку ошибок и очистку ресурсов.</w:t>
       </w:r>
     </w:p>
     <w:p>
@@ -5109,7 +4885,6 @@
         </w:rPr>
         <w:t>Вопрос</w:t>
       </w:r>
-      <w:proofErr w:type="gramStart"/>
       <w:r>
         <w:rPr>
           <w:rFonts w:ascii="Times New Roman" w:hAnsi="Times New Roman" w:cs="Times New Roman"/>
@@ -5119,19 +4894,7 @@
           <w:szCs w:val="28"/>
           <w:lang w:val="ru-RU"/>
         </w:rPr>
-        <w:t>: Все</w:t>
-      </w:r>
-      <w:proofErr w:type="gramEnd"/>
-      <w:r>
-        <w:rPr>
-          <w:rFonts w:ascii="Times New Roman" w:hAnsi="Times New Roman" w:cs="Times New Roman"/>
-          <w:bCs/>
-          <w:i/>
-          <w:sz w:val="28"/>
-          <w:szCs w:val="28"/>
-          <w:lang w:val="ru-RU"/>
-        </w:rPr>
-        <w:t xml:space="preserve"> ли процессы созданы успешно? Если нет, почему?</w:t>
+        <w:t>: Все ли процессы созданы успешно? Если нет, почему?</w:t>
       </w:r>
     </w:p>
     <w:p>
@@ -5996,7 +5759,6 @@
         <w:t xml:space="preserve">Сколько новых процессов появится в результате выполнения программой следующей последовательности вызовов </w:t>
       </w:r>
       <w:proofErr w:type="spellStart"/>
-      <w:proofErr w:type="gramStart"/>
       <w:r>
         <w:rPr>
           <w:rFonts w:ascii="Times New Roman" w:hAnsi="Times New Roman" w:cs="Times New Roman"/>
@@ -6016,17 +5778,7 @@
           <w:szCs w:val="28"/>
           <w:lang w:val="ru-RU"/>
         </w:rPr>
-        <w:t>(</w:t>
-      </w:r>
-      <w:proofErr w:type="gramEnd"/>
-      <w:r>
-        <w:rPr>
-          <w:rFonts w:ascii="Times New Roman" w:hAnsi="Times New Roman" w:cs="Times New Roman"/>
-          <w:sz w:val="28"/>
-          <w:szCs w:val="28"/>
-          <w:lang w:val="ru-RU"/>
-        </w:rPr>
-        <w:t>) (учитывая, что все они выполнятся успешно)?</w:t>
+        <w:t>() (учитывая, что все они выполнятся успешно)?</w:t>
       </w:r>
     </w:p>
     <w:p>
@@ -6043,7 +5795,6 @@
         </w:rPr>
       </w:pPr>
       <w:proofErr w:type="spellStart"/>
-      <w:proofErr w:type="gramStart"/>
       <w:r>
         <w:rPr>
           <w:rFonts w:ascii="Times New Roman" w:hAnsi="Times New Roman" w:cs="Times New Roman"/>
@@ -6063,17 +5814,7 @@
           <w:szCs w:val="28"/>
           <w:lang w:val="ru-RU"/>
         </w:rPr>
-        <w:t>(</w:t>
-      </w:r>
-      <w:proofErr w:type="gramEnd"/>
-      <w:r>
-        <w:rPr>
-          <w:rFonts w:ascii="Times New Roman" w:hAnsi="Times New Roman" w:cs="Times New Roman"/>
-          <w:sz w:val="28"/>
-          <w:szCs w:val="28"/>
-          <w:lang w:val="ru-RU"/>
-        </w:rPr>
-        <w:t>);</w:t>
+        <w:t>();</w:t>
       </w:r>
     </w:p>
     <w:p>
@@ -6090,7 +5831,6 @@
         </w:rPr>
       </w:pPr>
       <w:proofErr w:type="spellStart"/>
-      <w:proofErr w:type="gramStart"/>
       <w:r>
         <w:rPr>
           <w:rFonts w:ascii="Times New Roman" w:hAnsi="Times New Roman" w:cs="Times New Roman"/>
@@ -6110,17 +5850,7 @@
           <w:szCs w:val="28"/>
           <w:lang w:val="ru-RU"/>
         </w:rPr>
-        <w:t>(</w:t>
-      </w:r>
-      <w:proofErr w:type="gramEnd"/>
-      <w:r>
-        <w:rPr>
-          <w:rFonts w:ascii="Times New Roman" w:hAnsi="Times New Roman" w:cs="Times New Roman"/>
-          <w:sz w:val="28"/>
-          <w:szCs w:val="28"/>
-          <w:lang w:val="ru-RU"/>
-        </w:rPr>
-        <w:t>);</w:t>
+        <w:t>();</w:t>
       </w:r>
     </w:p>
     <w:p>
@@ -6137,7 +5867,6 @@
         </w:rPr>
       </w:pPr>
       <w:proofErr w:type="spellStart"/>
-      <w:proofErr w:type="gramStart"/>
       <w:r>
         <w:rPr>
           <w:rFonts w:ascii="Times New Roman" w:hAnsi="Times New Roman" w:cs="Times New Roman"/>
@@ -6157,17 +5886,7 @@
           <w:szCs w:val="28"/>
           <w:lang w:val="ru-RU"/>
         </w:rPr>
-        <w:t>(</w:t>
-      </w:r>
-      <w:proofErr w:type="gramEnd"/>
-      <w:r>
-        <w:rPr>
-          <w:rFonts w:ascii="Times New Roman" w:hAnsi="Times New Roman" w:cs="Times New Roman"/>
-          <w:sz w:val="28"/>
-          <w:szCs w:val="28"/>
-          <w:lang w:val="ru-RU"/>
-        </w:rPr>
-        <w:t>);</w:t>
+        <w:t>();</w:t>
       </w:r>
     </w:p>
     <w:p>
@@ -6797,7 +6516,7 @@
 </file>
 
 <file path=word/numbering.xml><?xml version="1.0" encoding="utf-8"?>
-<w:numbering xmlns:wpc="http://schemas.microsoft.com/office/word/2010/wordprocessingCanvas" xmlns:cx="http://schemas.microsoft.com/office/drawing/2014/chartex" xmlns:cx1="http://schemas.microsoft.com/office/drawing/2015/9/8/chartex" xmlns:cx2="http://schemas.microsoft.com/office/drawing/2015/10/21/chartex" xmlns:cx3="http://schemas.microsoft.com/office/drawing/2016/5/9/chartex" xmlns:cx4="http://schemas.microsoft.com/office/drawing/2016/5/10/chartex" xmlns:cx5="http://schemas.microsoft.com/office/drawing/2016/5/11/chartex" xmlns:cx6="http://schemas.microsoft.com/office/drawing/2016/5/12/chartex" xmlns:cx7="http://schemas.microsoft.com/office/drawing/2016/5/13/chartex" xmlns:cx8="http://schemas.microsoft.com/office/drawing/2016/5/14/chartex" xmlns:mc="http://schemas.openxmlformats.org/markup-compatibility/2006" xmlns:aink="http://schemas.microsoft.com/office/drawing/2016/ink" xmlns:am3d="http://schemas.microsoft.com/office/drawing/2017/model3d" xmlns:o="urn:schemas-microsoft-com:office:office" xmlns:oel="http://schemas.microsoft.com/office/2019/extlst" xmlns:r="http://schemas.openxmlformats.org/officeDocument/2006/relationships" xmlns:m="http://schemas.openxmlformats.org/officeDocument/2006/math" xmlns:v="urn:schemas-microsoft-com:vml" xmlns:wp14="http://schemas.microsoft.com/office/word/2010/wordprocessingDrawing" xmlns:wp="http://schemas.openxmlformats.org/drawingml/2006/wordprocessingDrawing" xmlns:w10="urn:schemas-microsoft-com:office:word" xmlns:w="http://schemas.openxmlformats.org/wordprocessingml/2006/main" xmlns:w14="http://schemas.microsoft.com/office/word/2010/wordml" xmlns:w15="http://schemas.microsoft.com/office/word/2012/wordml" xmlns:w16cex="http://schemas.microsoft.com/office/word/2018/wordml/cex" xmlns:w16cid="http://schemas.microsoft.com/office/word/2016/wordml/cid" xmlns:w16="http://schemas.microsoft.com/office/word/2018/wordml" xmlns:w16sdtdh="http://schemas.microsoft.com/office/word/2020/wordml/sdtdatahash" xmlns:w16se="http://schemas.microsoft.com/office/word/2015/wordml/symex" xmlns:wpg="http://schemas.microsoft.com/office/word/2010/wordprocessingGroup" xmlns:wpi="http://schemas.microsoft.com/office/word/2010/wordprocessingInk" xmlns:wne="http://schemas.microsoft.com/office/word/2006/wordml" xmlns:wps="http://schemas.microsoft.com/office/word/2010/wordprocessingShape" mc:Ignorable="w14 w15 w16se w16cid w16 w16cex w16sdtdh wp14">
+<w:numbering xmlns:wpc="http://schemas.microsoft.com/office/word/2010/wordprocessingCanvas" xmlns:cx="http://schemas.microsoft.com/office/drawing/2014/chartex" xmlns:cx1="http://schemas.microsoft.com/office/drawing/2015/9/8/chartex" xmlns:cx2="http://schemas.microsoft.com/office/drawing/2015/10/21/chartex" xmlns:cx3="http://schemas.microsoft.com/office/drawing/2016/5/9/chartex" xmlns:cx4="http://schemas.microsoft.com/office/drawing/2016/5/10/chartex" xmlns:cx5="http://schemas.microsoft.com/office/drawing/2016/5/11/chartex" xmlns:cx6="http://schemas.microsoft.com/office/drawing/2016/5/12/chartex" xmlns:cx7="http://schemas.microsoft.com/office/drawing/2016/5/13/chartex" xmlns:cx8="http://schemas.microsoft.com/office/drawing/2016/5/14/chartex" xmlns:mc="http://schemas.openxmlformats.org/markup-compatibility/2006" xmlns:aink="http://schemas.microsoft.com/office/drawing/2016/ink" xmlns:am3d="http://schemas.microsoft.com/office/drawing/2017/model3d" xmlns:o="urn:schemas-microsoft-com:office:office" xmlns:r="http://schemas.openxmlformats.org/officeDocument/2006/relationships" xmlns:m="http://schemas.openxmlformats.org/officeDocument/2006/math" xmlns:v="urn:schemas-microsoft-com:vml" xmlns:wp14="http://schemas.microsoft.com/office/word/2010/wordprocessingDrawing" xmlns:wp="http://schemas.openxmlformats.org/drawingml/2006/wordprocessingDrawing" xmlns:w10="urn:schemas-microsoft-com:office:word" xmlns:w="http://schemas.openxmlformats.org/wordprocessingml/2006/main" xmlns:w14="http://schemas.microsoft.com/office/word/2010/wordml" xmlns:w15="http://schemas.microsoft.com/office/word/2012/wordml" xmlns:w16cex="http://schemas.microsoft.com/office/word/2018/wordml/cex" xmlns:w16cid="http://schemas.microsoft.com/office/word/2016/wordml/cid" xmlns:w16="http://schemas.microsoft.com/office/word/2018/wordml" xmlns:w16sdtdh="http://schemas.microsoft.com/office/word/2020/wordml/sdtdatahash" xmlns:w16se="http://schemas.microsoft.com/office/word/2015/wordml/symex" xmlns:wpg="http://schemas.microsoft.com/office/word/2010/wordprocessingGroup" xmlns:wpi="http://schemas.microsoft.com/office/word/2010/wordprocessingInk" xmlns:wne="http://schemas.microsoft.com/office/word/2006/wordml" xmlns:wps="http://schemas.microsoft.com/office/word/2010/wordprocessingShape" mc:Ignorable="w14 w15 w16se w16cid w16 w16cex w16sdtdh wp14">
   <w:abstractNum w:abstractNumId="0" w15:restartNumberingAfterBreak="0">
     <w:nsid w:val="00E63897"/>
     <w:multiLevelType w:val="hybridMultilevel"/>
@@ -10263,103 +9982,103 @@
       </w:rPr>
     </w:lvl>
   </w:abstractNum>
-  <w:num w:numId="1" w16cid:durableId="57440982">
+  <w:num w:numId="1">
     <w:abstractNumId w:val="23"/>
   </w:num>
-  <w:num w:numId="2" w16cid:durableId="1090198456">
+  <w:num w:numId="2">
     <w:abstractNumId w:val="10"/>
   </w:num>
-  <w:num w:numId="3" w16cid:durableId="502547916">
+  <w:num w:numId="3">
     <w:abstractNumId w:val="11"/>
   </w:num>
-  <w:num w:numId="4" w16cid:durableId="717247409">
+  <w:num w:numId="4">
     <w:abstractNumId w:val="24"/>
   </w:num>
-  <w:num w:numId="5" w16cid:durableId="1437867819">
+  <w:num w:numId="5">
     <w:abstractNumId w:val="29"/>
   </w:num>
-  <w:num w:numId="6" w16cid:durableId="1944342329">
+  <w:num w:numId="6">
     <w:abstractNumId w:val="30"/>
   </w:num>
-  <w:num w:numId="7" w16cid:durableId="1148862395">
+  <w:num w:numId="7">
     <w:abstractNumId w:val="8"/>
   </w:num>
-  <w:num w:numId="8" w16cid:durableId="1337535860">
+  <w:num w:numId="8">
     <w:abstractNumId w:val="7"/>
   </w:num>
-  <w:num w:numId="9" w16cid:durableId="1284846259">
+  <w:num w:numId="9">
     <w:abstractNumId w:val="20"/>
   </w:num>
-  <w:num w:numId="10" w16cid:durableId="1537501226">
+  <w:num w:numId="10">
     <w:abstractNumId w:val="16"/>
   </w:num>
-  <w:num w:numId="11" w16cid:durableId="1837722181">
+  <w:num w:numId="11">
     <w:abstractNumId w:val="16"/>
   </w:num>
-  <w:num w:numId="12" w16cid:durableId="895508912">
+  <w:num w:numId="12">
     <w:abstractNumId w:val="3"/>
   </w:num>
-  <w:num w:numId="13" w16cid:durableId="2143382210">
+  <w:num w:numId="13">
     <w:abstractNumId w:val="13"/>
   </w:num>
-  <w:num w:numId="14" w16cid:durableId="204102932">
+  <w:num w:numId="14">
     <w:abstractNumId w:val="1"/>
   </w:num>
-  <w:num w:numId="15" w16cid:durableId="1403139287">
+  <w:num w:numId="15">
     <w:abstractNumId w:val="26"/>
   </w:num>
-  <w:num w:numId="16" w16cid:durableId="1101294249">
+  <w:num w:numId="16">
     <w:abstractNumId w:val="18"/>
   </w:num>
-  <w:num w:numId="17" w16cid:durableId="1283686242">
+  <w:num w:numId="17">
     <w:abstractNumId w:val="4"/>
   </w:num>
-  <w:num w:numId="18" w16cid:durableId="797648580">
+  <w:num w:numId="18">
     <w:abstractNumId w:val="19"/>
   </w:num>
-  <w:num w:numId="19" w16cid:durableId="1497762936">
+  <w:num w:numId="19">
     <w:abstractNumId w:val="5"/>
   </w:num>
-  <w:num w:numId="20" w16cid:durableId="890922163">
+  <w:num w:numId="20">
     <w:abstractNumId w:val="2"/>
   </w:num>
-  <w:num w:numId="21" w16cid:durableId="967006972">
+  <w:num w:numId="21">
     <w:abstractNumId w:val="14"/>
   </w:num>
-  <w:num w:numId="22" w16cid:durableId="326592380">
+  <w:num w:numId="22">
     <w:abstractNumId w:val="9"/>
   </w:num>
-  <w:num w:numId="23" w16cid:durableId="2034381238">
+  <w:num w:numId="23">
     <w:abstractNumId w:val="17"/>
   </w:num>
-  <w:num w:numId="24" w16cid:durableId="1080981124">
+  <w:num w:numId="24">
     <w:abstractNumId w:val="28"/>
   </w:num>
-  <w:num w:numId="25" w16cid:durableId="1034769278">
+  <w:num w:numId="25">
     <w:abstractNumId w:val="22"/>
   </w:num>
-  <w:num w:numId="26" w16cid:durableId="1300843718">
+  <w:num w:numId="26">
     <w:abstractNumId w:val="25"/>
   </w:num>
-  <w:num w:numId="27" w16cid:durableId="1340698108">
+  <w:num w:numId="27">
     <w:abstractNumId w:val="6"/>
   </w:num>
-  <w:num w:numId="28" w16cid:durableId="1119111041">
+  <w:num w:numId="28">
     <w:abstractNumId w:val="21"/>
   </w:num>
-  <w:num w:numId="29" w16cid:durableId="902720563">
+  <w:num w:numId="29">
     <w:abstractNumId w:val="15"/>
   </w:num>
-  <w:num w:numId="30" w16cid:durableId="1784498163">
+  <w:num w:numId="30">
     <w:abstractNumId w:val="27"/>
   </w:num>
-  <w:num w:numId="31" w16cid:durableId="1841430850">
+  <w:num w:numId="31">
     <w:abstractNumId w:val="31"/>
   </w:num>
-  <w:num w:numId="32" w16cid:durableId="541987623">
+  <w:num w:numId="32">
     <w:abstractNumId w:val="0"/>
   </w:num>
-  <w:num w:numId="33" w16cid:durableId="679502678">
+  <w:num w:numId="33">
     <w:abstractNumId w:val="12"/>
   </w:num>
 </w:numbering>
@@ -10770,6 +10489,7 @@
   <w:style w:type="character" w:default="1" w:styleId="a0">
     <w:name w:val="Default Paragraph Font"/>
     <w:uiPriority w:val="1"/>
+    <w:semiHidden/>
     <w:unhideWhenUsed/>
   </w:style>
   <w:style w:type="table" w:default="1" w:styleId="a1">

</xml_diff>